<commit_message>
feat: 多用户角色体系(admin/operator/viewer 接口级权限) + 调用日志自动归档(LOG_RETENTION_DAYS, gzip NDJSON)
</commit_message>
<xml_diff>
--- a/docs/WebAPI管理平台部署手册.docx
+++ b/docs/WebAPI管理平台部署手册.docx
@@ -312,7 +312,7 @@
             <w:ind w:left="0"/>
           </w:pPr>
           <w:r>
-            <w:t>六、初始账号与安全设置</w:t>
+            <w:t>六、初始账号、用户角色与安全设置</w:t>
           </w:r>
           <w:r>
             <w:tab/>
@@ -477,7 +477,7 @@
           <w:sz w:val="24"/>
           <w:szCs w:val="24"/>
         </w:rPr>
-        <w:t xml:space="preserve">WebAPI 管理平台是一套全栈 API 网关管理控制台，覆盖 API 从注册、发布、监控到废弃的完整生命周期。系统由管理控制台（前端）与网关服务（后端）两部分组成，提供 API 注册与管理（含后端地址连通性测试）、分组管理、应用密钥（AccessKey/SecretKey）授权、真实网关转发（鉴权、限流、超时重试、熔断）、运行监控与告警、调用日志审计、管理员登录认证等功能。</w:t>
+        <w:t xml:space="preserve">WebAPI 管理平台是一套全栈 API 网关管理控制台，覆盖 API 从注册、发布、监控到废弃的完整生命周期。系统由管理控制台（前端）与网关服务（后端）两部分组成，提供 API 注册与管理（含后端地址连通性测试）、分组管理、应用密钥（AccessKey/SecretKey）授权、真实网关转发（鉴权、限流、超时重试、熔断）、运行监控与告警、调用日志审计、多用户角色权限（管理员/操作员/只读）、调用日志自动归档、登录认证等功能。</w:t>
       </w:r>
     </w:p>
     <w:p>
@@ -2020,7 +2020,7 @@
                 <w:sz w:val="24"/>
                 <w:szCs w:val="24"/>
               </w:rPr>
-              <w:t xml:space="preserve">数据库文件</w:t>
+              <w:t xml:space="preserve">LOG_RETENTION_DAYS（环境变量）</w:t>
             </w:r>
           </w:p>
         </w:tc>
@@ -2044,7 +2044,7 @@
                 <w:sz w:val="24"/>
                 <w:szCs w:val="24"/>
               </w:rPr>
-              <w:t xml:space="preserve">server/data.db</w:t>
+              <w:t xml:space="preserve">30</w:t>
             </w:r>
           </w:p>
         </w:tc>
@@ -2068,7 +2068,7 @@
                 <w:sz w:val="24"/>
                 <w:szCs w:val="24"/>
               </w:rPr>
-              <w:t xml:space="preserve">SQLite 单文件，自动创建</w:t>
+              <w:t xml:space="preserve">调用日志保留天数，超期日志自动压缩归档（gzip NDJSON）到 server/archives/</w:t>
             </w:r>
           </w:p>
         </w:tc>
@@ -2094,6 +2094,80 @@
                 <w:sz w:val="24"/>
                 <w:szCs w:val="24"/>
               </w:rPr>
+              <w:t xml:space="preserve">数据库文件</w:t>
+            </w:r>
+          </w:p>
+        </w:tc>
+        <w:tc>
+          <w:tcPr>
+            <w:tcW w:type="dxa" w:w="2400"/>
+            <w:tcMar>
+              <w:top w:type="dxa" w:w="100"/>
+              <w:left w:type="dxa" w:w="120"/>
+              <w:bottom w:type="dxa" w:w="100"/>
+              <w:right w:type="dxa" w:w="120"/>
+            </w:tcMar>
+          </w:tcPr>
+          <w:p>
+            <w:pPr>
+              <w:spacing w:after="40" w:line="280"/>
+            </w:pPr>
+            <w:r>
+              <w:rPr>
+                <w:rFonts w:ascii="Times New Roman" w:cs="Times New Roman" w:eastAsia="SimSun" w:hAnsi="Times New Roman"/>
+                <w:sz w:val="24"/>
+                <w:szCs w:val="24"/>
+              </w:rPr>
+              <w:t xml:space="preserve">server/data.db</w:t>
+            </w:r>
+          </w:p>
+        </w:tc>
+        <w:tc>
+          <w:tcPr>
+            <w:tcW w:type="dxa" w:w="3000"/>
+            <w:tcMar>
+              <w:top w:type="dxa" w:w="100"/>
+              <w:left w:type="dxa" w:w="120"/>
+              <w:bottom w:type="dxa" w:w="100"/>
+              <w:right w:type="dxa" w:w="120"/>
+            </w:tcMar>
+          </w:tcPr>
+          <w:p>
+            <w:pPr>
+              <w:spacing w:after="40" w:line="280"/>
+            </w:pPr>
+            <w:r>
+              <w:rPr>
+                <w:rFonts w:ascii="Times New Roman" w:cs="Times New Roman" w:eastAsia="SimSun" w:hAnsi="Times New Roman"/>
+                <w:sz w:val="24"/>
+                <w:szCs w:val="24"/>
+              </w:rPr>
+              <w:t xml:space="preserve">SQLite 单文件，自动创建</w:t>
+            </w:r>
+          </w:p>
+        </w:tc>
+      </w:tr>
+      <w:tr>
+        <w:tc>
+          <w:tcPr>
+            <w:tcW w:type="dxa" w:w="2400"/>
+            <w:tcMar>
+              <w:top w:type="dxa" w:w="100"/>
+              <w:left w:type="dxa" w:w="120"/>
+              <w:bottom w:type="dxa" w:w="100"/>
+              <w:right w:type="dxa" w:w="120"/>
+            </w:tcMar>
+          </w:tcPr>
+          <w:p>
+            <w:pPr>
+              <w:spacing w:after="40" w:line="280"/>
+            </w:pPr>
+            <w:r>
+              <w:rPr>
+                <w:rFonts w:ascii="Times New Roman" w:cs="Times New Roman" w:eastAsia="SimSun" w:hAnsi="Times New Roman"/>
+                <w:sz w:val="24"/>
+                <w:szCs w:val="24"/>
+              </w:rPr>
               <w:t xml:space="preserve">会话有效期</w:t>
             </w:r>
           </w:p>
@@ -2142,7 +2216,7 @@
                 <w:sz w:val="24"/>
                 <w:szCs w:val="24"/>
               </w:rPr>
-              <w:t xml:space="preserve">管理员登录令牌过期时间（server/auth.js SESSION_TTL）</w:t>
+              <w:t xml:space="preserve">登录令牌过期时间（server/auth.js SESSION_TTL）</w:t>
             </w:r>
           </w:p>
         </w:tc>
@@ -2384,7 +2458,7 @@
           <w:sz w:val="30"/>
           <w:szCs w:val="30"/>
         </w:rPr>
-        <w:t xml:space="preserve">六、初始账号与安全设置</w:t>
+        <w:t xml:space="preserve">六、初始账号、用户角色与安全设置</w:t>
       </w:r>
     </w:p>
     <w:p>
@@ -2462,7 +2536,7 @@
           <w:sz w:val="24"/>
           <w:szCs w:val="24"/>
         </w:rPr>
-        <w:t xml:space="preserve">其他安全建议：</w:t>
+        <w:t xml:space="preserve">系统支持多用户与三级角色，管理员可在"系统管理"页面创建和维护用户：</w:t>
       </w:r>
     </w:p>
     <w:p>
@@ -2480,7 +2554,7 @@
           <w:sz w:val="24"/>
           <w:szCs w:val="24"/>
         </w:rPr>
-        <w:t xml:space="preserve">调用方应用的 SecretKey 仅授权人员可见，泄露后请立即在"应用与密钥"页面重置。</w:t>
+        <w:t xml:space="preserve">管理员（admin）：全部权限，含用户管理、删除 API/分组/应用/规则、日志归档与数据重置。</w:t>
       </w:r>
     </w:p>
     <w:p>
@@ -2498,7 +2572,7 @@
           <w:sz w:val="24"/>
           <w:szCs w:val="24"/>
         </w:rPr>
-        <w:t xml:space="preserve">停用不再使用的应用，网关会立即拒绝其全部调用。</w:t>
+        <w:t xml:space="preserve">操作员（operator）：可注册、发布、编辑 API，管理分组/应用/告警规则，确认告警，执行连通性测试。</w:t>
       </w:r>
     </w:p>
     <w:p>
@@ -2516,7 +2590,35 @@
           <w:sz w:val="24"/>
           <w:szCs w:val="24"/>
         </w:rPr>
-        <w:t xml:space="preserve">建议通过 Nginx 启用 HTTPS，避免 AccessKey 与登录口令明文传输。</w:t>
+        <w:t xml:space="preserve">只读（viewer）：仅可查看各页面与日志，所有写操作会被后端拒绝（HTTP 403）。</w:t>
+      </w:r>
+    </w:p>
+    <w:p>
+      <w:pPr>
+        <w:spacing w:after="160" w:line="300"/>
+        <w:ind w:firstLine="475"/>
+      </w:pPr>
+      <w:r>
+        <w:rPr>
+          <w:rFonts w:ascii="Times New Roman" w:cs="Times New Roman" w:eastAsia="SimSun" w:hAnsi="Times New Roman"/>
+          <w:sz w:val="24"/>
+          <w:szCs w:val="24"/>
+        </w:rPr>
+        <w:t xml:space="preserve">角色变更或重置密码后，该用户的已登录会话立即失效；系统禁止删除当前登录账号，并保证至少保留一名管理员。建议按最小权限原则为运维人员分配操作员角色、为访客分配只读角色。</w:t>
+      </w:r>
+    </w:p>
+    <w:p>
+      <w:pPr>
+        <w:spacing w:after="160" w:line="300"/>
+        <w:ind w:firstLine="475"/>
+      </w:pPr>
+      <w:r>
+        <w:rPr>
+          <w:rFonts w:ascii="Times New Roman" w:cs="Times New Roman" w:eastAsia="SimSun" w:hAnsi="Times New Roman"/>
+          <w:sz w:val="24"/>
+          <w:szCs w:val="24"/>
+        </w:rPr>
+        <w:t xml:space="preserve">其他安全建议：</w:t>
       </w:r>
     </w:p>
     <w:p>
@@ -2534,293 +2636,7 @@
           <w:sz w:val="24"/>
           <w:szCs w:val="24"/>
         </w:rPr>
-        <w:t xml:space="preserve">控制台会话有效期 12 小时，连续登录失败 5 次账号锁定 5 分钟。</w:t>
-      </w:r>
-    </w:p>
-    <w:p>
-      <w:pPr>
-        <w:pStyle w:val="Heading1"/>
-        <w:spacing w:after="160" w:before="320"/>
-      </w:pPr>
-      <w:r>
-        <w:rPr>
-          <w:rFonts w:ascii="Times New Roman" w:cs="Times New Roman" w:eastAsia="SimSun" w:hAnsi="Times New Roman"/>
-          <w:b/>
-          <w:bCs/>
-          <w:color w:val="1F2A37"/>
-          <w:sz w:val="30"/>
-          <w:szCs w:val="30"/>
-        </w:rPr>
-        <w:t xml:space="preserve">七、部署验证</w:t>
-      </w:r>
-    </w:p>
-    <w:p>
-      <w:pPr>
-        <w:spacing w:after="160" w:line="300"/>
-        <w:ind w:firstLine="475"/>
-      </w:pPr>
-      <w:r>
-        <w:rPr>
-          <w:rFonts w:ascii="Times New Roman" w:cs="Times New Roman" w:eastAsia="SimSun" w:hAnsi="Times New Roman"/>
-          <w:sz w:val="24"/>
-          <w:szCs w:val="24"/>
-        </w:rPr>
-        <w:t xml:space="preserve">以下命令在服务器本机执行使用 localhost 即可；从其他计算机验证时，将 localhost 替换为服务器 IP 地址。</w:t>
-      </w:r>
-    </w:p>
-    <w:p>
-      <w:pPr>
-        <w:spacing w:after="160" w:line="300"/>
-        <w:ind w:firstLine="475"/>
-      </w:pPr>
-      <w:r>
-        <w:rPr>
-          <w:rFonts w:ascii="Times New Roman" w:cs="Times New Roman" w:eastAsia="SimSun" w:hAnsi="Times New Roman"/>
-          <w:sz w:val="24"/>
-          <w:szCs w:val="24"/>
-        </w:rPr>
-        <w:t xml:space="preserve">步骤一：后端健康检查。</w:t>
-      </w:r>
-    </w:p>
-    <w:p>
-      <w:pPr>
-        <w:shd w:fill="F4F5F7" w:val="clear"/>
-        <w:spacing w:after="0" w:line="260"/>
-        <w:ind w:left="288" w:right="288"/>
-      </w:pPr>
-      <w:r>
-        <w:rPr>
-          <w:rFonts w:ascii="Courier New" w:cs="Courier New" w:eastAsia="SimSun" w:hAnsi="Courier New"/>
-          <w:color w:val="333333"/>
-          <w:sz w:val="18"/>
-          <w:szCs w:val="18"/>
-        </w:rPr>
-        <w:t xml:space="preserve">curl http://localhost:3100/healthz</w:t>
-      </w:r>
-    </w:p>
-    <w:p>
-      <w:pPr>
-        <w:shd w:fill="F4F5F7" w:val="clear"/>
-        <w:spacing w:after="0" w:line="260"/>
-        <w:ind w:left="288" w:right="288"/>
-      </w:pPr>
-      <w:r>
-        <w:rPr>
-          <w:rFonts w:ascii="Courier New" w:cs="Courier New" w:eastAsia="SimSun" w:hAnsi="Courier New"/>
-          <w:color w:val="333333"/>
-          <w:sz w:val="18"/>
-          <w:szCs w:val="18"/>
-        </w:rPr>
-        <w:t xml:space="preserve"># 期望输出：{"ok":true,"uptime":...}</w:t>
-      </w:r>
-    </w:p>
-    <w:p>
-      <w:pPr>
-        <w:spacing w:after="160" w:line="300"/>
-        <w:ind w:firstLine="475"/>
-      </w:pPr>
-      <w:r>
-        <w:rPr>
-          <w:rFonts w:ascii="Times New Roman" w:cs="Times New Roman" w:eastAsia="SimSun" w:hAnsi="Times New Roman"/>
-          <w:sz w:val="24"/>
-          <w:szCs w:val="24"/>
-        </w:rPr>
-        <w:t xml:space="preserve">步骤二：管理员登录并获取令牌。</w:t>
-      </w:r>
-    </w:p>
-    <w:p>
-      <w:pPr>
-        <w:shd w:fill="F4F5F7" w:val="clear"/>
-        <w:spacing w:after="0" w:line="260"/>
-        <w:ind w:left="288" w:right="288"/>
-      </w:pPr>
-      <w:r>
-        <w:rPr>
-          <w:rFonts w:ascii="Courier New" w:cs="Courier New" w:eastAsia="SimSun" w:hAnsi="Courier New"/>
-          <w:color w:val="333333"/>
-          <w:sz w:val="18"/>
-          <w:szCs w:val="18"/>
-        </w:rPr>
-        <w:t xml:space="preserve">curl -X POST http://localhost:3100/admin/auth/login \</w:t>
-      </w:r>
-    </w:p>
-    <w:p>
-      <w:pPr>
-        <w:shd w:fill="F4F5F7" w:val="clear"/>
-        <w:spacing w:after="0" w:line="260"/>
-        <w:ind w:left="288" w:right="288"/>
-      </w:pPr>
-      <w:r>
-        <w:rPr>
-          <w:rFonts w:ascii="Courier New" w:cs="Courier New" w:eastAsia="SimSun" w:hAnsi="Courier New"/>
-          <w:color w:val="333333"/>
-          <w:sz w:val="18"/>
-          <w:szCs w:val="18"/>
-        </w:rPr>
-        <w:t xml:space="preserve">  -H "Content-Type: application/json" \</w:t>
-      </w:r>
-    </w:p>
-    <w:p>
-      <w:pPr>
-        <w:shd w:fill="F4F5F7" w:val="clear"/>
-        <w:spacing w:after="0" w:line="260"/>
-        <w:ind w:left="288" w:right="288"/>
-      </w:pPr>
-      <w:r>
-        <w:rPr>
-          <w:rFonts w:ascii="Courier New" w:cs="Courier New" w:eastAsia="SimSun" w:hAnsi="Courier New"/>
-          <w:color w:val="333333"/>
-          <w:sz w:val="18"/>
-          <w:szCs w:val="18"/>
-        </w:rPr>
-        <w:t xml:space="preserve">  -d '{"username":"admin","password":"Admin@123"}'</w:t>
-      </w:r>
-    </w:p>
-    <w:p>
-      <w:pPr>
-        <w:spacing w:after="160" w:line="300"/>
-        <w:ind w:firstLine="475"/>
-      </w:pPr>
-      <w:r>
-        <w:rPr>
-          <w:rFonts w:ascii="Times New Roman" w:cs="Times New Roman" w:eastAsia="SimSun" w:hAnsi="Times New Roman"/>
-          <w:sz w:val="24"/>
-          <w:szCs w:val="24"/>
-        </w:rPr>
-        <w:t xml:space="preserve">步骤三：通过网关发起一次真实调用。登录控制台，在"应用与密钥"页面复制任一启用中应用的 AccessKey，然后：</w:t>
-      </w:r>
-    </w:p>
-    <w:p>
-      <w:pPr>
-        <w:shd w:fill="F4F5F7" w:val="clear"/>
-        <w:spacing w:after="0" w:line="260"/>
-        <w:ind w:left="288" w:right="288"/>
-      </w:pPr>
-      <w:r>
-        <w:rPr>
-          <w:rFonts w:ascii="Courier New" w:cs="Courier New" w:eastAsia="SimSun" w:hAnsi="Courier New"/>
-          <w:color w:val="333333"/>
-          <w:sz w:val="18"/>
-          <w:szCs w:val="18"/>
-        </w:rPr>
-        <w:t xml:space="preserve">curl -H "X-Access-Key: &lt;AccessKey&gt;" http://localhost:3100/gw/api/v1/users/123</w:t>
-      </w:r>
-    </w:p>
-    <w:p>
-      <w:pPr>
-        <w:spacing w:after="160" w:line="300"/>
-        <w:ind w:firstLine="475"/>
-      </w:pPr>
-      <w:r>
-        <w:rPr>
-          <w:rFonts w:ascii="Times New Roman" w:cs="Times New Roman" w:eastAsia="SimSun" w:hAnsi="Times New Roman"/>
-          <w:sz w:val="24"/>
-          <w:szCs w:val="24"/>
-        </w:rPr>
-        <w:t xml:space="preserve">预期返回 code 为 0 的 JSON 响应。随后在控制台"监控告警"页可看到实时流量曲线出现调用记录，在"调用日志"页可看到该次请求的审计记录，即表示部署成功。</w:t>
-      </w:r>
-    </w:p>
-    <w:p>
-      <w:pPr>
-        <w:spacing w:after="160" w:line="300"/>
-        <w:ind w:firstLine="475"/>
-      </w:pPr>
-      <w:r>
-        <w:rPr>
-          <w:rFonts w:ascii="Times New Roman" w:cs="Times New Roman" w:eastAsia="SimSun" w:hAnsi="Times New Roman"/>
-          <w:sz w:val="24"/>
-          <w:szCs w:val="24"/>
-        </w:rPr>
-        <w:t xml:space="preserve">提示：后续注册新 API 时，填写"后端服务地址"后可直接点击旁边的"测试连接"按钮，由服务器真实探测目标地址的可达性（返回 HTTP 状态码与延迟），确认连通后再保存，可有效避免注册无效接口。</w:t>
-      </w:r>
-    </w:p>
-    <w:p>
-      <w:pPr>
-        <w:pStyle w:val="Heading1"/>
-        <w:spacing w:after="160" w:before="320"/>
-      </w:pPr>
-      <w:r>
-        <w:rPr>
-          <w:rFonts w:ascii="Times New Roman" w:cs="Times New Roman" w:eastAsia="SimSun" w:hAnsi="Times New Roman"/>
-          <w:b/>
-          <w:bCs/>
-          <w:color w:val="1F2A37"/>
-          <w:sz w:val="30"/>
-          <w:szCs w:val="30"/>
-        </w:rPr>
-        <w:t xml:space="preserve">八、数据与备份</w:t>
-      </w:r>
-    </w:p>
-    <w:p>
-      <w:pPr>
-        <w:spacing w:after="160" w:line="300"/>
-        <w:ind w:firstLine="475"/>
-      </w:pPr>
-      <w:r>
-        <w:rPr>
-          <w:rFonts w:ascii="Times New Roman" w:cs="Times New Roman" w:eastAsia="SimSun" w:hAnsi="Times New Roman"/>
-          <w:sz w:val="24"/>
-          <w:szCs w:val="24"/>
-        </w:rPr>
-        <w:t xml:space="preserve">系统全部业务数据存储于单个 SQLite 文件 server/data.db，包括：API 定义、分组、应用密钥、告警规则与记录、按天聚合指标、调用日志、管理员账号（密码为加盐哈希，不含明文）。</w:t>
-      </w:r>
-    </w:p>
-    <w:p>
-      <w:pPr>
-        <w:spacing w:after="160" w:line="300"/>
-        <w:ind w:firstLine="475"/>
-      </w:pPr>
-      <w:r>
-        <w:rPr>
-          <w:rFonts w:ascii="Times New Roman" w:cs="Times New Roman" w:eastAsia="SimSun" w:hAnsi="Times New Roman"/>
-          <w:sz w:val="24"/>
-          <w:szCs w:val="24"/>
-        </w:rPr>
-        <w:t xml:space="preserve">备份方式：停止后端服务后直接复制该文件即可；运行中备份请使用 SQLite 在线备份命令：</w:t>
-      </w:r>
-    </w:p>
-    <w:p>
-      <w:pPr>
-        <w:shd w:fill="F4F5F7" w:val="clear"/>
-        <w:spacing w:after="0" w:line="260"/>
-        <w:ind w:left="288" w:right="288"/>
-      </w:pPr>
-      <w:r>
-        <w:rPr>
-          <w:rFonts w:ascii="Courier New" w:cs="Courier New" w:eastAsia="SimSun" w:hAnsi="Courier New"/>
-          <w:color w:val="333333"/>
-          <w:sz w:val="18"/>
-          <w:szCs w:val="18"/>
-        </w:rPr>
-        <w:t xml:space="preserve">sqlite3 server/data.db ".backup backup/data-$(date +%F).db"</w:t>
-      </w:r>
-    </w:p>
-    <w:p>
-      <w:pPr>
-        <w:spacing w:after="160" w:line="300"/>
-        <w:ind w:firstLine="475"/>
-      </w:pPr>
-      <w:r>
-        <w:rPr>
-          <w:rFonts w:ascii="Times New Roman" w:cs="Times New Roman" w:eastAsia="SimSun" w:hAnsi="Times New Roman"/>
-          <w:sz w:val="24"/>
-          <w:szCs w:val="24"/>
-        </w:rPr>
-        <w:t xml:space="preserve">恢复方式：停止后端服务，用备份文件替换 server/data.db 后重新启动。</w:t>
-      </w:r>
-    </w:p>
-    <w:p>
-      <w:pPr>
-        <w:spacing w:after="160" w:line="300"/>
-        <w:ind w:firstLine="475"/>
-      </w:pPr>
-      <w:r>
-        <w:rPr>
-          <w:rFonts w:ascii="Times New Roman" w:cs="Times New Roman" w:eastAsia="SimSun" w:hAnsi="Times New Roman"/>
-          <w:sz w:val="24"/>
-          <w:szCs w:val="24"/>
-        </w:rPr>
-        <w:t xml:space="preserve">注意事项：</w:t>
+        <w:t xml:space="preserve">调用方应用的 SecretKey 仅授权人员可见，泄露后请立即在"应用与密钥"页面重置。</w:t>
       </w:r>
     </w:p>
     <w:p>
@@ -2838,7 +2654,7 @@
           <w:sz w:val="24"/>
           <w:szCs w:val="24"/>
         </w:rPr>
-        <w:t xml:space="preserve">限流计数与熔断状态保存在内存中，重启后端后自动清零，不影响持久化数据。</w:t>
+        <w:t xml:space="preserve">停用不再使用的应用，网关会立即拒绝其全部调用。</w:t>
       </w:r>
     </w:p>
     <w:p>
@@ -2856,7 +2672,7 @@
           <w:sz w:val="24"/>
           <w:szCs w:val="24"/>
         </w:rPr>
-        <w:t xml:space="preserve">如需恢复出厂示例数据，可登录后调用管理接口 POST /admin/reset（会清空业务数据，但不影响管理员账号与密码）。</w:t>
+        <w:t xml:space="preserve">建议通过 Nginx 启用 HTTPS，避免 AccessKey 与登录口令明文传输。</w:t>
       </w:r>
     </w:p>
     <w:p>
@@ -2874,7 +2690,347 @@
           <w:sz w:val="24"/>
           <w:szCs w:val="24"/>
         </w:rPr>
-        <w:t xml:space="preserve">调用日志默认保留最近 20000 条，超出自动修剪；如需长期归档请定期导出备份。</w:t>
+        <w:t xml:space="preserve">控制台会话有效期 12 小时，连续登录失败 5 次账号锁定 5 分钟。</w:t>
+      </w:r>
+    </w:p>
+    <w:p>
+      <w:pPr>
+        <w:pStyle w:val="Heading1"/>
+        <w:spacing w:after="160" w:before="320"/>
+      </w:pPr>
+      <w:r>
+        <w:rPr>
+          <w:rFonts w:ascii="Times New Roman" w:cs="Times New Roman" w:eastAsia="SimSun" w:hAnsi="Times New Roman"/>
+          <w:b/>
+          <w:bCs/>
+          <w:color w:val="1F2A37"/>
+          <w:sz w:val="30"/>
+          <w:szCs w:val="30"/>
+        </w:rPr>
+        <w:t xml:space="preserve">七、部署验证</w:t>
+      </w:r>
+    </w:p>
+    <w:p>
+      <w:pPr>
+        <w:spacing w:after="160" w:line="300"/>
+        <w:ind w:firstLine="475"/>
+      </w:pPr>
+      <w:r>
+        <w:rPr>
+          <w:rFonts w:ascii="Times New Roman" w:cs="Times New Roman" w:eastAsia="SimSun" w:hAnsi="Times New Roman"/>
+          <w:sz w:val="24"/>
+          <w:szCs w:val="24"/>
+        </w:rPr>
+        <w:t xml:space="preserve">以下命令在服务器本机执行使用 localhost 即可；从其他计算机验证时，将 localhost 替换为服务器 IP 地址。</w:t>
+      </w:r>
+    </w:p>
+    <w:p>
+      <w:pPr>
+        <w:spacing w:after="160" w:line="300"/>
+        <w:ind w:firstLine="475"/>
+      </w:pPr>
+      <w:r>
+        <w:rPr>
+          <w:rFonts w:ascii="Times New Roman" w:cs="Times New Roman" w:eastAsia="SimSun" w:hAnsi="Times New Roman"/>
+          <w:sz w:val="24"/>
+          <w:szCs w:val="24"/>
+        </w:rPr>
+        <w:t xml:space="preserve">步骤一：后端健康检查。</w:t>
+      </w:r>
+    </w:p>
+    <w:p>
+      <w:pPr>
+        <w:shd w:fill="F4F5F7" w:val="clear"/>
+        <w:spacing w:after="0" w:line="260"/>
+        <w:ind w:left="288" w:right="288"/>
+      </w:pPr>
+      <w:r>
+        <w:rPr>
+          <w:rFonts w:ascii="Courier New" w:cs="Courier New" w:eastAsia="SimSun" w:hAnsi="Courier New"/>
+          <w:color w:val="333333"/>
+          <w:sz w:val="18"/>
+          <w:szCs w:val="18"/>
+        </w:rPr>
+        <w:t xml:space="preserve">curl http://localhost:3100/healthz</w:t>
+      </w:r>
+    </w:p>
+    <w:p>
+      <w:pPr>
+        <w:shd w:fill="F4F5F7" w:val="clear"/>
+        <w:spacing w:after="0" w:line="260"/>
+        <w:ind w:left="288" w:right="288"/>
+      </w:pPr>
+      <w:r>
+        <w:rPr>
+          <w:rFonts w:ascii="Courier New" w:cs="Courier New" w:eastAsia="SimSun" w:hAnsi="Courier New"/>
+          <w:color w:val="333333"/>
+          <w:sz w:val="18"/>
+          <w:szCs w:val="18"/>
+        </w:rPr>
+        <w:t xml:space="preserve"># 期望输出：{"ok":true,"uptime":...}</w:t>
+      </w:r>
+    </w:p>
+    <w:p>
+      <w:pPr>
+        <w:spacing w:after="160" w:line="300"/>
+        <w:ind w:firstLine="475"/>
+      </w:pPr>
+      <w:r>
+        <w:rPr>
+          <w:rFonts w:ascii="Times New Roman" w:cs="Times New Roman" w:eastAsia="SimSun" w:hAnsi="Times New Roman"/>
+          <w:sz w:val="24"/>
+          <w:szCs w:val="24"/>
+        </w:rPr>
+        <w:t xml:space="preserve">步骤二：管理员登录并获取令牌。</w:t>
+      </w:r>
+    </w:p>
+    <w:p>
+      <w:pPr>
+        <w:shd w:fill="F4F5F7" w:val="clear"/>
+        <w:spacing w:after="0" w:line="260"/>
+        <w:ind w:left="288" w:right="288"/>
+      </w:pPr>
+      <w:r>
+        <w:rPr>
+          <w:rFonts w:ascii="Courier New" w:cs="Courier New" w:eastAsia="SimSun" w:hAnsi="Courier New"/>
+          <w:color w:val="333333"/>
+          <w:sz w:val="18"/>
+          <w:szCs w:val="18"/>
+        </w:rPr>
+        <w:t xml:space="preserve">curl -X POST http://localhost:3100/admin/auth/login \</w:t>
+      </w:r>
+    </w:p>
+    <w:p>
+      <w:pPr>
+        <w:shd w:fill="F4F5F7" w:val="clear"/>
+        <w:spacing w:after="0" w:line="260"/>
+        <w:ind w:left="288" w:right="288"/>
+      </w:pPr>
+      <w:r>
+        <w:rPr>
+          <w:rFonts w:ascii="Courier New" w:cs="Courier New" w:eastAsia="SimSun" w:hAnsi="Courier New"/>
+          <w:color w:val="333333"/>
+          <w:sz w:val="18"/>
+          <w:szCs w:val="18"/>
+        </w:rPr>
+        <w:t xml:space="preserve">  -H "Content-Type: application/json" \</w:t>
+      </w:r>
+    </w:p>
+    <w:p>
+      <w:pPr>
+        <w:shd w:fill="F4F5F7" w:val="clear"/>
+        <w:spacing w:after="0" w:line="260"/>
+        <w:ind w:left="288" w:right="288"/>
+      </w:pPr>
+      <w:r>
+        <w:rPr>
+          <w:rFonts w:ascii="Courier New" w:cs="Courier New" w:eastAsia="SimSun" w:hAnsi="Courier New"/>
+          <w:color w:val="333333"/>
+          <w:sz w:val="18"/>
+          <w:szCs w:val="18"/>
+        </w:rPr>
+        <w:t xml:space="preserve">  -d '{"username":"admin","password":"Admin@123"}'</w:t>
+      </w:r>
+    </w:p>
+    <w:p>
+      <w:pPr>
+        <w:spacing w:after="160" w:line="300"/>
+        <w:ind w:firstLine="475"/>
+      </w:pPr>
+      <w:r>
+        <w:rPr>
+          <w:rFonts w:ascii="Times New Roman" w:cs="Times New Roman" w:eastAsia="SimSun" w:hAnsi="Times New Roman"/>
+          <w:sz w:val="24"/>
+          <w:szCs w:val="24"/>
+        </w:rPr>
+        <w:t xml:space="preserve">步骤三：通过网关发起一次真实调用。登录控制台，在"应用与密钥"页面复制任一启用中应用的 AccessKey，然后：</w:t>
+      </w:r>
+    </w:p>
+    <w:p>
+      <w:pPr>
+        <w:shd w:fill="F4F5F7" w:val="clear"/>
+        <w:spacing w:after="0" w:line="260"/>
+        <w:ind w:left="288" w:right="288"/>
+      </w:pPr>
+      <w:r>
+        <w:rPr>
+          <w:rFonts w:ascii="Courier New" w:cs="Courier New" w:eastAsia="SimSun" w:hAnsi="Courier New"/>
+          <w:color w:val="333333"/>
+          <w:sz w:val="18"/>
+          <w:szCs w:val="18"/>
+        </w:rPr>
+        <w:t xml:space="preserve">curl -H "X-Access-Key: &lt;AccessKey&gt;" http://localhost:3100/gw/api/v1/users/123</w:t>
+      </w:r>
+    </w:p>
+    <w:p>
+      <w:pPr>
+        <w:spacing w:after="160" w:line="300"/>
+        <w:ind w:firstLine="475"/>
+      </w:pPr>
+      <w:r>
+        <w:rPr>
+          <w:rFonts w:ascii="Times New Roman" w:cs="Times New Roman" w:eastAsia="SimSun" w:hAnsi="Times New Roman"/>
+          <w:sz w:val="24"/>
+          <w:szCs w:val="24"/>
+        </w:rPr>
+        <w:t xml:space="preserve">预期返回 code 为 0 的 JSON 响应。随后在控制台"监控告警"页可看到实时流量曲线出现调用记录，在"调用日志"页可看到该次请求的审计记录，即表示部署成功。</w:t>
+      </w:r>
+    </w:p>
+    <w:p>
+      <w:pPr>
+        <w:spacing w:after="160" w:line="300"/>
+        <w:ind w:firstLine="475"/>
+      </w:pPr>
+      <w:r>
+        <w:rPr>
+          <w:rFonts w:ascii="Times New Roman" w:cs="Times New Roman" w:eastAsia="SimSun" w:hAnsi="Times New Roman"/>
+          <w:sz w:val="24"/>
+          <w:szCs w:val="24"/>
+        </w:rPr>
+        <w:t xml:space="preserve">提示：后续注册新 API 时，填写"后端服务地址"后可直接点击旁边的"测试连接"按钮，由服务器真实探测目标地址的可达性（返回 HTTP 状态码与延迟），确认连通后再保存，可有效避免注册无效接口。</w:t>
+      </w:r>
+    </w:p>
+    <w:p>
+      <w:pPr>
+        <w:pStyle w:val="Heading1"/>
+        <w:spacing w:after="160" w:before="320"/>
+      </w:pPr>
+      <w:r>
+        <w:rPr>
+          <w:rFonts w:ascii="Times New Roman" w:cs="Times New Roman" w:eastAsia="SimSun" w:hAnsi="Times New Roman"/>
+          <w:b/>
+          <w:bCs/>
+          <w:color w:val="1F2A37"/>
+          <w:sz w:val="30"/>
+          <w:szCs w:val="30"/>
+        </w:rPr>
+        <w:t xml:space="preserve">八、数据与备份</w:t>
+      </w:r>
+    </w:p>
+    <w:p>
+      <w:pPr>
+        <w:spacing w:after="160" w:line="300"/>
+        <w:ind w:firstLine="475"/>
+      </w:pPr>
+      <w:r>
+        <w:rPr>
+          <w:rFonts w:ascii="Times New Roman" w:cs="Times New Roman" w:eastAsia="SimSun" w:hAnsi="Times New Roman"/>
+          <w:sz w:val="24"/>
+          <w:szCs w:val="24"/>
+        </w:rPr>
+        <w:t xml:space="preserve">系统全部业务数据存储于单个 SQLite 文件 server/data.db，包括：API 定义、分组、应用密钥、告警规则与记录、按天聚合指标、调用日志、管理员账号（密码为加盐哈希，不含明文）。</w:t>
+      </w:r>
+    </w:p>
+    <w:p>
+      <w:pPr>
+        <w:spacing w:after="160" w:line="300"/>
+        <w:ind w:firstLine="475"/>
+      </w:pPr>
+      <w:r>
+        <w:rPr>
+          <w:rFonts w:ascii="Times New Roman" w:cs="Times New Roman" w:eastAsia="SimSun" w:hAnsi="Times New Roman"/>
+          <w:sz w:val="24"/>
+          <w:szCs w:val="24"/>
+        </w:rPr>
+        <w:t xml:space="preserve">备份方式：停止后端服务后直接复制该文件即可；运行中备份请使用 SQLite 在线备份命令：</w:t>
+      </w:r>
+    </w:p>
+    <w:p>
+      <w:pPr>
+        <w:shd w:fill="F4F5F7" w:val="clear"/>
+        <w:spacing w:after="0" w:line="260"/>
+        <w:ind w:left="288" w:right="288"/>
+      </w:pPr>
+      <w:r>
+        <w:rPr>
+          <w:rFonts w:ascii="Courier New" w:cs="Courier New" w:eastAsia="SimSun" w:hAnsi="Courier New"/>
+          <w:color w:val="333333"/>
+          <w:sz w:val="18"/>
+          <w:szCs w:val="18"/>
+        </w:rPr>
+        <w:t xml:space="preserve">sqlite3 server/data.db ".backup backup/data-$(date +%F).db"</w:t>
+      </w:r>
+    </w:p>
+    <w:p>
+      <w:pPr>
+        <w:spacing w:after="160" w:line="300"/>
+        <w:ind w:firstLine="475"/>
+      </w:pPr>
+      <w:r>
+        <w:rPr>
+          <w:rFonts w:ascii="Times New Roman" w:cs="Times New Roman" w:eastAsia="SimSun" w:hAnsi="Times New Roman"/>
+          <w:sz w:val="24"/>
+          <w:szCs w:val="24"/>
+        </w:rPr>
+        <w:t xml:space="preserve">恢复方式：停止后端服务，用备份文件替换 server/data.db 后重新启动。</w:t>
+      </w:r>
+    </w:p>
+    <w:p>
+      <w:pPr>
+        <w:spacing w:after="160" w:line="300"/>
+        <w:ind w:firstLine="475"/>
+      </w:pPr>
+      <w:r>
+        <w:rPr>
+          <w:rFonts w:ascii="Times New Roman" w:cs="Times New Roman" w:eastAsia="SimSun" w:hAnsi="Times New Roman"/>
+          <w:sz w:val="24"/>
+          <w:szCs w:val="24"/>
+        </w:rPr>
+        <w:t xml:space="preserve">注意事项：</w:t>
+      </w:r>
+    </w:p>
+    <w:p>
+      <w:pPr>
+        <w:pStyle w:val="ListParagraph"/>
+        <w:numPr>
+          <w:ilvl w:val="0"/>
+          <w:numId w:val="1"/>
+        </w:numPr>
+        <w:spacing w:after="80" w:line="300"/>
+      </w:pPr>
+      <w:r>
+        <w:rPr>
+          <w:rFonts w:ascii="Times New Roman" w:cs="Times New Roman" w:eastAsia="SimSun" w:hAnsi="Times New Roman"/>
+          <w:sz w:val="24"/>
+          <w:szCs w:val="24"/>
+        </w:rPr>
+        <w:t xml:space="preserve">限流计数与熔断状态保存在内存中，重启后端后自动清零，不影响持久化数据。</w:t>
+      </w:r>
+    </w:p>
+    <w:p>
+      <w:pPr>
+        <w:pStyle w:val="ListParagraph"/>
+        <w:numPr>
+          <w:ilvl w:val="0"/>
+          <w:numId w:val="1"/>
+        </w:numPr>
+        <w:spacing w:after="80" w:line="300"/>
+      </w:pPr>
+      <w:r>
+        <w:rPr>
+          <w:rFonts w:ascii="Times New Roman" w:cs="Times New Roman" w:eastAsia="SimSun" w:hAnsi="Times New Roman"/>
+          <w:sz w:val="24"/>
+          <w:szCs w:val="24"/>
+        </w:rPr>
+        <w:t xml:space="preserve">如需恢复出厂示例数据，可登录后调用管理接口 POST /admin/reset（会清空业务数据，但不影响用户账号与密码），仅管理员可调用。</w:t>
+      </w:r>
+    </w:p>
+    <w:p>
+      <w:pPr>
+        <w:pStyle w:val="ListParagraph"/>
+        <w:numPr>
+          <w:ilvl w:val="0"/>
+          <w:numId w:val="1"/>
+        </w:numPr>
+        <w:spacing w:after="80" w:line="300"/>
+      </w:pPr>
+      <w:r>
+        <w:rPr>
+          <w:rFonts w:ascii="Times New Roman" w:cs="Times New Roman" w:eastAsia="SimSun" w:hAnsi="Times New Roman"/>
+          <w:sz w:val="24"/>
+          <w:szCs w:val="24"/>
+        </w:rPr>
+        <w:t xml:space="preserve">调用日志超过保留期（默认 30 天，LOG_RETENTION_DAYS 可调）后，系统启动时与每 24 小时自动压缩归档到 server/archives/（gzip NDJSON 格式）并从库中清除；管理员可在"系统管理"页面手动触发归档或下载归档文件。备份时请连同 server/archives/ 目录一并复制。</w:t>
       </w:r>
     </w:p>
     <w:p>
@@ -3697,7 +3853,7 @@
                 <w:sz w:val="24"/>
                 <w:szCs w:val="24"/>
               </w:rPr>
-              <w:t xml:space="preserve">管理员登录（公开），返回会话令牌</w:t>
+              <w:t xml:space="preserve">登录（公开），返回会话令牌与角色</w:t>
             </w:r>
           </w:p>
         </w:tc>
@@ -3771,7 +3927,7 @@
                 <w:sz w:val="24"/>
                 <w:szCs w:val="24"/>
               </w:rPr>
-              <w:t xml:space="preserve">查询当前登录用户</w:t>
+              <w:t xml:space="preserve">查询当前登录用户与角色</w:t>
             </w:r>
           </w:p>
         </w:tc>
@@ -3945,7 +4101,7 @@
                 <w:sz w:val="24"/>
                 <w:szCs w:val="24"/>
               </w:rPr>
-              <w:t xml:space="preserve">/admin/state</w:t>
+              <w:t xml:space="preserve">/admin/users</w:t>
             </w:r>
           </w:p>
         </w:tc>
@@ -3969,7 +4125,7 @@
                 <w:sz w:val="24"/>
                 <w:szCs w:val="24"/>
               </w:rPr>
-              <w:t xml:space="preserve">GET</w:t>
+              <w:t xml:space="preserve">GET/POST</w:t>
             </w:r>
           </w:p>
         </w:tc>
@@ -3993,7 +4149,7 @@
                 <w:sz w:val="24"/>
                 <w:szCs w:val="24"/>
               </w:rPr>
-              <w:t xml:space="preserve">获取全量状态（API/分组/应用/规则/告警）</w:t>
+              <w:t xml:space="preserve">用户列表 / 新建或更新用户（角色、重置密码），仅管理员</w:t>
             </w:r>
           </w:p>
         </w:tc>
@@ -4019,7 +4175,7 @@
                 <w:sz w:val="24"/>
                 <w:szCs w:val="24"/>
               </w:rPr>
-              <w:t xml:space="preserve">/admin/metrics</w:t>
+              <w:t xml:space="preserve">/admin/users/:username</w:t>
             </w:r>
           </w:p>
         </w:tc>
@@ -4043,7 +4199,7 @@
                 <w:sz w:val="24"/>
                 <w:szCs w:val="24"/>
               </w:rPr>
-              <w:t xml:space="preserve">GET</w:t>
+              <w:t xml:space="preserve">DELETE</w:t>
             </w:r>
           </w:p>
         </w:tc>
@@ -4067,7 +4223,7 @@
                 <w:sz w:val="24"/>
                 <w:szCs w:val="24"/>
               </w:rPr>
-              <w:t xml:space="preserve">按天聚合指标，参数 apiId、days</w:t>
+              <w:t xml:space="preserve">删除用户（不能删自己，至少保留一名管理员），仅管理员</w:t>
             </w:r>
           </w:p>
         </w:tc>
@@ -4093,7 +4249,7 @@
                 <w:sz w:val="24"/>
                 <w:szCs w:val="24"/>
               </w:rPr>
-              <w:t xml:space="preserve">/admin/logs</w:t>
+              <w:t xml:space="preserve">/admin/archives</w:t>
             </w:r>
           </w:p>
         </w:tc>
@@ -4141,7 +4297,7 @@
                 <w:sz w:val="24"/>
                 <w:szCs w:val="24"/>
               </w:rPr>
-              <w:t xml:space="preserve">调用日志分页查询，参数 apiId/statusClass/appName/keyword/page</w:t>
+              <w:t xml:space="preserve">归档文件列表与保留天数，仅管理员</w:t>
             </w:r>
           </w:p>
         </w:tc>
@@ -4167,7 +4323,7 @@
                 <w:sz w:val="24"/>
                 <w:szCs w:val="24"/>
               </w:rPr>
-              <w:t xml:space="preserve">/admin/logs/minutes</w:t>
+              <w:t xml:space="preserve">/admin/archives/run</w:t>
             </w:r>
           </w:p>
         </w:tc>
@@ -4191,7 +4347,7 @@
                 <w:sz w:val="24"/>
                 <w:szCs w:val="24"/>
               </w:rPr>
-              <w:t xml:space="preserve">GET</w:t>
+              <w:t xml:space="preserve">POST</w:t>
             </w:r>
           </w:p>
         </w:tc>
@@ -4215,7 +4371,7 @@
                 <w:sz w:val="24"/>
                 <w:szCs w:val="24"/>
               </w:rPr>
-              <w:t xml:space="preserve">分钟级实时流量聚合，参数 minutes、apiId</w:t>
+              <w:t xml:space="preserve">手动触发一次日志归档，仅管理员</w:t>
             </w:r>
           </w:p>
         </w:tc>
@@ -4241,7 +4397,7 @@
                 <w:sz w:val="24"/>
                 <w:szCs w:val="24"/>
               </w:rPr>
-              <w:t xml:space="preserve">/admin/apis</w:t>
+              <w:t xml:space="preserve">/admin/archives/download?file=</w:t>
             </w:r>
           </w:p>
         </w:tc>
@@ -4265,7 +4421,7 @@
                 <w:sz w:val="24"/>
                 <w:szCs w:val="24"/>
               </w:rPr>
-              <w:t xml:space="preserve">POST</w:t>
+              <w:t xml:space="preserve">GET</w:t>
             </w:r>
           </w:p>
         </w:tc>
@@ -4289,7 +4445,7 @@
                 <w:sz w:val="24"/>
                 <w:szCs w:val="24"/>
               </w:rPr>
-              <w:t xml:space="preserve">注册或更新 API</w:t>
+              <w:t xml:space="preserve">下载归档文件（gzip NDJSON），仅管理员</w:t>
             </w:r>
           </w:p>
         </w:tc>
@@ -4315,7 +4471,7 @@
                 <w:sz w:val="24"/>
                 <w:szCs w:val="24"/>
               </w:rPr>
-              <w:t xml:space="preserve">/admin/apis/:id</w:t>
+              <w:t xml:space="preserve">/admin/state</w:t>
             </w:r>
           </w:p>
         </w:tc>
@@ -4339,7 +4495,7 @@
                 <w:sz w:val="24"/>
                 <w:szCs w:val="24"/>
               </w:rPr>
-              <w:t xml:space="preserve">DELETE</w:t>
+              <w:t xml:space="preserve">GET</w:t>
             </w:r>
           </w:p>
         </w:tc>
@@ -4363,7 +4519,7 @@
                 <w:sz w:val="24"/>
                 <w:szCs w:val="24"/>
               </w:rPr>
-              <w:t xml:space="preserve">删除 API（联动清理应用授权）</w:t>
+              <w:t xml:space="preserve">获取全量状态（API/分组/应用/规则/告警）</w:t>
             </w:r>
           </w:p>
         </w:tc>
@@ -4389,7 +4545,7 @@
                 <w:sz w:val="24"/>
                 <w:szCs w:val="24"/>
               </w:rPr>
-              <w:t xml:space="preserve">/admin/apis/:id/status</w:t>
+              <w:t xml:space="preserve">/admin/metrics</w:t>
             </w:r>
           </w:p>
         </w:tc>
@@ -4413,7 +4569,7 @@
                 <w:sz w:val="24"/>
                 <w:szCs w:val="24"/>
               </w:rPr>
-              <w:t xml:space="preserve">POST</w:t>
+              <w:t xml:space="preserve">GET</w:t>
             </w:r>
           </w:p>
         </w:tc>
@@ -4437,7 +4593,7 @@
                 <w:sz w:val="24"/>
                 <w:szCs w:val="24"/>
               </w:rPr>
-              <w:t xml:space="preserve">API 状态流转（发布/下线/废弃/草稿）</w:t>
+              <w:t xml:space="preserve">按天聚合指标，参数 apiId、days</w:t>
             </w:r>
           </w:p>
         </w:tc>
@@ -4463,7 +4619,7 @@
                 <w:sz w:val="24"/>
                 <w:szCs w:val="24"/>
               </w:rPr>
-              <w:t xml:space="preserve">/admin/groups、/admin/apps、/admin/rules</w:t>
+              <w:t xml:space="preserve">/admin/logs</w:t>
             </w:r>
           </w:p>
         </w:tc>
@@ -4487,7 +4643,7 @@
                 <w:sz w:val="24"/>
                 <w:szCs w:val="24"/>
               </w:rPr>
-              <w:t xml:space="preserve">POST/DELETE</w:t>
+              <w:t xml:space="preserve">GET</w:t>
             </w:r>
           </w:p>
         </w:tc>
@@ -4511,7 +4667,7 @@
                 <w:sz w:val="24"/>
                 <w:szCs w:val="24"/>
               </w:rPr>
-              <w:t xml:space="preserve">分组、应用、告警规则的保存与删除</w:t>
+              <w:t xml:space="preserve">调用日志分页查询，参数 apiId/statusClass/appName/keyword/page</w:t>
             </w:r>
           </w:p>
         </w:tc>
@@ -4537,7 +4693,7 @@
                 <w:sz w:val="24"/>
                 <w:szCs w:val="24"/>
               </w:rPr>
-              <w:t xml:space="preserve">/admin/alerts/:id/ack</w:t>
+              <w:t xml:space="preserve">/admin/logs/minutes</w:t>
             </w:r>
           </w:p>
         </w:tc>
@@ -4561,7 +4717,7 @@
                 <w:sz w:val="24"/>
                 <w:szCs w:val="24"/>
               </w:rPr>
-              <w:t xml:space="preserve">POST</w:t>
+              <w:t xml:space="preserve">GET</w:t>
             </w:r>
           </w:p>
         </w:tc>
@@ -4585,7 +4741,7 @@
                 <w:sz w:val="24"/>
                 <w:szCs w:val="24"/>
               </w:rPr>
-              <w:t xml:space="preserve">标记告警已处理</w:t>
+              <w:t xml:space="preserve">分钟级实时流量聚合，参数 minutes、apiId</w:t>
             </w:r>
           </w:p>
         </w:tc>
@@ -4611,7 +4767,7 @@
                 <w:sz w:val="24"/>
                 <w:szCs w:val="24"/>
               </w:rPr>
-              <w:t xml:space="preserve">/admin/reset</w:t>
+              <w:t xml:space="preserve">/admin/apis</w:t>
             </w:r>
           </w:p>
         </w:tc>
@@ -4659,7 +4815,7 @@
                 <w:sz w:val="24"/>
                 <w:szCs w:val="24"/>
               </w:rPr>
-              <w:t xml:space="preserve">重置为出厂示例数据（不影响管理员账号）</w:t>
+              <w:t xml:space="preserve">注册或更新 API（需操作员及以上）</w:t>
             </w:r>
           </w:p>
         </w:tc>
@@ -4685,6 +4841,376 @@
                 <w:sz w:val="24"/>
                 <w:szCs w:val="24"/>
               </w:rPr>
+              <w:t xml:space="preserve">/admin/apis/:id</w:t>
+            </w:r>
+          </w:p>
+        </w:tc>
+        <w:tc>
+          <w:tcPr>
+            <w:tcW w:type="dxa" w:w="1800"/>
+            <w:tcMar>
+              <w:top w:type="dxa" w:w="100"/>
+              <w:left w:type="dxa" w:w="120"/>
+              <w:bottom w:type="dxa" w:w="100"/>
+              <w:right w:type="dxa" w:w="120"/>
+            </w:tcMar>
+          </w:tcPr>
+          <w:p>
+            <w:pPr>
+              <w:spacing w:after="40" w:line="280"/>
+            </w:pPr>
+            <w:r>
+              <w:rPr>
+                <w:rFonts w:ascii="Times New Roman" w:cs="Times New Roman" w:eastAsia="SimSun" w:hAnsi="Times New Roman"/>
+                <w:sz w:val="24"/>
+                <w:szCs w:val="24"/>
+              </w:rPr>
+              <w:t xml:space="preserve">DELETE</w:t>
+            </w:r>
+          </w:p>
+        </w:tc>
+        <w:tc>
+          <w:tcPr>
+            <w:tcW w:type="dxa" w:w="3200"/>
+            <w:tcMar>
+              <w:top w:type="dxa" w:w="100"/>
+              <w:left w:type="dxa" w:w="120"/>
+              <w:bottom w:type="dxa" w:w="100"/>
+              <w:right w:type="dxa" w:w="120"/>
+            </w:tcMar>
+          </w:tcPr>
+          <w:p>
+            <w:pPr>
+              <w:spacing w:after="40" w:line="280"/>
+            </w:pPr>
+            <w:r>
+              <w:rPr>
+                <w:rFonts w:ascii="Times New Roman" w:cs="Times New Roman" w:eastAsia="SimSun" w:hAnsi="Times New Roman"/>
+                <w:sz w:val="24"/>
+                <w:szCs w:val="24"/>
+              </w:rPr>
+              <w:t xml:space="preserve">删除 API（联动清理应用授权），仅管理员</w:t>
+            </w:r>
+          </w:p>
+        </w:tc>
+      </w:tr>
+      <w:tr>
+        <w:tc>
+          <w:tcPr>
+            <w:tcW w:type="dxa" w:w="2800"/>
+            <w:tcMar>
+              <w:top w:type="dxa" w:w="100"/>
+              <w:left w:type="dxa" w:w="120"/>
+              <w:bottom w:type="dxa" w:w="100"/>
+              <w:right w:type="dxa" w:w="120"/>
+            </w:tcMar>
+          </w:tcPr>
+          <w:p>
+            <w:pPr>
+              <w:spacing w:after="40" w:line="280"/>
+            </w:pPr>
+            <w:r>
+              <w:rPr>
+                <w:rFonts w:ascii="Times New Roman" w:cs="Times New Roman" w:eastAsia="SimSun" w:hAnsi="Times New Roman"/>
+                <w:sz w:val="24"/>
+                <w:szCs w:val="24"/>
+              </w:rPr>
+              <w:t xml:space="preserve">/admin/apis/:id/status</w:t>
+            </w:r>
+          </w:p>
+        </w:tc>
+        <w:tc>
+          <w:tcPr>
+            <w:tcW w:type="dxa" w:w="1800"/>
+            <w:tcMar>
+              <w:top w:type="dxa" w:w="100"/>
+              <w:left w:type="dxa" w:w="120"/>
+              <w:bottom w:type="dxa" w:w="100"/>
+              <w:right w:type="dxa" w:w="120"/>
+            </w:tcMar>
+          </w:tcPr>
+          <w:p>
+            <w:pPr>
+              <w:spacing w:after="40" w:line="280"/>
+            </w:pPr>
+            <w:r>
+              <w:rPr>
+                <w:rFonts w:ascii="Times New Roman" w:cs="Times New Roman" w:eastAsia="SimSun" w:hAnsi="Times New Roman"/>
+                <w:sz w:val="24"/>
+                <w:szCs w:val="24"/>
+              </w:rPr>
+              <w:t xml:space="preserve">POST</w:t>
+            </w:r>
+          </w:p>
+        </w:tc>
+        <w:tc>
+          <w:tcPr>
+            <w:tcW w:type="dxa" w:w="3200"/>
+            <w:tcMar>
+              <w:top w:type="dxa" w:w="100"/>
+              <w:left w:type="dxa" w:w="120"/>
+              <w:bottom w:type="dxa" w:w="100"/>
+              <w:right w:type="dxa" w:w="120"/>
+            </w:tcMar>
+          </w:tcPr>
+          <w:p>
+            <w:pPr>
+              <w:spacing w:after="40" w:line="280"/>
+            </w:pPr>
+            <w:r>
+              <w:rPr>
+                <w:rFonts w:ascii="Times New Roman" w:cs="Times New Roman" w:eastAsia="SimSun" w:hAnsi="Times New Roman"/>
+                <w:sz w:val="24"/>
+                <w:szCs w:val="24"/>
+              </w:rPr>
+              <w:t xml:space="preserve">API 状态流转（发布/下线/废弃/草稿），需操作员及以上</w:t>
+            </w:r>
+          </w:p>
+        </w:tc>
+      </w:tr>
+      <w:tr>
+        <w:tc>
+          <w:tcPr>
+            <w:tcW w:type="dxa" w:w="2800"/>
+            <w:tcMar>
+              <w:top w:type="dxa" w:w="100"/>
+              <w:left w:type="dxa" w:w="120"/>
+              <w:bottom w:type="dxa" w:w="100"/>
+              <w:right w:type="dxa" w:w="120"/>
+            </w:tcMar>
+          </w:tcPr>
+          <w:p>
+            <w:pPr>
+              <w:spacing w:after="40" w:line="280"/>
+            </w:pPr>
+            <w:r>
+              <w:rPr>
+                <w:rFonts w:ascii="Times New Roman" w:cs="Times New Roman" w:eastAsia="SimSun" w:hAnsi="Times New Roman"/>
+                <w:sz w:val="24"/>
+                <w:szCs w:val="24"/>
+              </w:rPr>
+              <w:t xml:space="preserve">/admin/groups、/admin/apps、/admin/rules</w:t>
+            </w:r>
+          </w:p>
+        </w:tc>
+        <w:tc>
+          <w:tcPr>
+            <w:tcW w:type="dxa" w:w="1800"/>
+            <w:tcMar>
+              <w:top w:type="dxa" w:w="100"/>
+              <w:left w:type="dxa" w:w="120"/>
+              <w:bottom w:type="dxa" w:w="100"/>
+              <w:right w:type="dxa" w:w="120"/>
+            </w:tcMar>
+          </w:tcPr>
+          <w:p>
+            <w:pPr>
+              <w:spacing w:after="40" w:line="280"/>
+            </w:pPr>
+            <w:r>
+              <w:rPr>
+                <w:rFonts w:ascii="Times New Roman" w:cs="Times New Roman" w:eastAsia="SimSun" w:hAnsi="Times New Roman"/>
+                <w:sz w:val="24"/>
+                <w:szCs w:val="24"/>
+              </w:rPr>
+              <w:t xml:space="preserve">POST/DELETE</w:t>
+            </w:r>
+          </w:p>
+        </w:tc>
+        <w:tc>
+          <w:tcPr>
+            <w:tcW w:type="dxa" w:w="3200"/>
+            <w:tcMar>
+              <w:top w:type="dxa" w:w="100"/>
+              <w:left w:type="dxa" w:w="120"/>
+              <w:bottom w:type="dxa" w:w="100"/>
+              <w:right w:type="dxa" w:w="120"/>
+            </w:tcMar>
+          </w:tcPr>
+          <w:p>
+            <w:pPr>
+              <w:spacing w:after="40" w:line="280"/>
+            </w:pPr>
+            <w:r>
+              <w:rPr>
+                <w:rFonts w:ascii="Times New Roman" w:cs="Times New Roman" w:eastAsia="SimSun" w:hAnsi="Times New Roman"/>
+                <w:sz w:val="24"/>
+                <w:szCs w:val="24"/>
+              </w:rPr>
+              <w:t xml:space="preserve">分组、应用、告警规则的保存（操作员及以上）与删除（仅管理员）</w:t>
+            </w:r>
+          </w:p>
+        </w:tc>
+      </w:tr>
+      <w:tr>
+        <w:tc>
+          <w:tcPr>
+            <w:tcW w:type="dxa" w:w="2800"/>
+            <w:tcMar>
+              <w:top w:type="dxa" w:w="100"/>
+              <w:left w:type="dxa" w:w="120"/>
+              <w:bottom w:type="dxa" w:w="100"/>
+              <w:right w:type="dxa" w:w="120"/>
+            </w:tcMar>
+          </w:tcPr>
+          <w:p>
+            <w:pPr>
+              <w:spacing w:after="40" w:line="280"/>
+            </w:pPr>
+            <w:r>
+              <w:rPr>
+                <w:rFonts w:ascii="Times New Roman" w:cs="Times New Roman" w:eastAsia="SimSun" w:hAnsi="Times New Roman"/>
+                <w:sz w:val="24"/>
+                <w:szCs w:val="24"/>
+              </w:rPr>
+              <w:t xml:space="preserve">/admin/alerts/:id/ack</w:t>
+            </w:r>
+          </w:p>
+        </w:tc>
+        <w:tc>
+          <w:tcPr>
+            <w:tcW w:type="dxa" w:w="1800"/>
+            <w:tcMar>
+              <w:top w:type="dxa" w:w="100"/>
+              <w:left w:type="dxa" w:w="120"/>
+              <w:bottom w:type="dxa" w:w="100"/>
+              <w:right w:type="dxa" w:w="120"/>
+            </w:tcMar>
+          </w:tcPr>
+          <w:p>
+            <w:pPr>
+              <w:spacing w:after="40" w:line="280"/>
+            </w:pPr>
+            <w:r>
+              <w:rPr>
+                <w:rFonts w:ascii="Times New Roman" w:cs="Times New Roman" w:eastAsia="SimSun" w:hAnsi="Times New Roman"/>
+                <w:sz w:val="24"/>
+                <w:szCs w:val="24"/>
+              </w:rPr>
+              <w:t xml:space="preserve">POST</w:t>
+            </w:r>
+          </w:p>
+        </w:tc>
+        <w:tc>
+          <w:tcPr>
+            <w:tcW w:type="dxa" w:w="3200"/>
+            <w:tcMar>
+              <w:top w:type="dxa" w:w="100"/>
+              <w:left w:type="dxa" w:w="120"/>
+              <w:bottom w:type="dxa" w:w="100"/>
+              <w:right w:type="dxa" w:w="120"/>
+            </w:tcMar>
+          </w:tcPr>
+          <w:p>
+            <w:pPr>
+              <w:spacing w:after="40" w:line="280"/>
+            </w:pPr>
+            <w:r>
+              <w:rPr>
+                <w:rFonts w:ascii="Times New Roman" w:cs="Times New Roman" w:eastAsia="SimSun" w:hAnsi="Times New Roman"/>
+                <w:sz w:val="24"/>
+                <w:szCs w:val="24"/>
+              </w:rPr>
+              <w:t xml:space="preserve">标记告警已处理（需操作员及以上）</w:t>
+            </w:r>
+          </w:p>
+        </w:tc>
+      </w:tr>
+      <w:tr>
+        <w:tc>
+          <w:tcPr>
+            <w:tcW w:type="dxa" w:w="2800"/>
+            <w:tcMar>
+              <w:top w:type="dxa" w:w="100"/>
+              <w:left w:type="dxa" w:w="120"/>
+              <w:bottom w:type="dxa" w:w="100"/>
+              <w:right w:type="dxa" w:w="120"/>
+            </w:tcMar>
+          </w:tcPr>
+          <w:p>
+            <w:pPr>
+              <w:spacing w:after="40" w:line="280"/>
+            </w:pPr>
+            <w:r>
+              <w:rPr>
+                <w:rFonts w:ascii="Times New Roman" w:cs="Times New Roman" w:eastAsia="SimSun" w:hAnsi="Times New Roman"/>
+                <w:sz w:val="24"/>
+                <w:szCs w:val="24"/>
+              </w:rPr>
+              <w:t xml:space="preserve">/admin/reset</w:t>
+            </w:r>
+          </w:p>
+        </w:tc>
+        <w:tc>
+          <w:tcPr>
+            <w:tcW w:type="dxa" w:w="1800"/>
+            <w:tcMar>
+              <w:top w:type="dxa" w:w="100"/>
+              <w:left w:type="dxa" w:w="120"/>
+              <w:bottom w:type="dxa" w:w="100"/>
+              <w:right w:type="dxa" w:w="120"/>
+            </w:tcMar>
+          </w:tcPr>
+          <w:p>
+            <w:pPr>
+              <w:spacing w:after="40" w:line="280"/>
+            </w:pPr>
+            <w:r>
+              <w:rPr>
+                <w:rFonts w:ascii="Times New Roman" w:cs="Times New Roman" w:eastAsia="SimSun" w:hAnsi="Times New Roman"/>
+                <w:sz w:val="24"/>
+                <w:szCs w:val="24"/>
+              </w:rPr>
+              <w:t xml:space="preserve">POST</w:t>
+            </w:r>
+          </w:p>
+        </w:tc>
+        <w:tc>
+          <w:tcPr>
+            <w:tcW w:type="dxa" w:w="3200"/>
+            <w:tcMar>
+              <w:top w:type="dxa" w:w="100"/>
+              <w:left w:type="dxa" w:w="120"/>
+              <w:bottom w:type="dxa" w:w="100"/>
+              <w:right w:type="dxa" w:w="120"/>
+            </w:tcMar>
+          </w:tcPr>
+          <w:p>
+            <w:pPr>
+              <w:spacing w:after="40" w:line="280"/>
+            </w:pPr>
+            <w:r>
+              <w:rPr>
+                <w:rFonts w:ascii="Times New Roman" w:cs="Times New Roman" w:eastAsia="SimSun" w:hAnsi="Times New Roman"/>
+                <w:sz w:val="24"/>
+                <w:szCs w:val="24"/>
+              </w:rPr>
+              <w:t xml:space="preserve">重置为出厂示例数据（不影响用户账号），仅管理员</w:t>
+            </w:r>
+          </w:p>
+        </w:tc>
+      </w:tr>
+      <w:tr>
+        <w:tc>
+          <w:tcPr>
+            <w:tcW w:type="dxa" w:w="2800"/>
+            <w:tcMar>
+              <w:top w:type="dxa" w:w="100"/>
+              <w:left w:type="dxa" w:w="120"/>
+              <w:bottom w:type="dxa" w:w="100"/>
+              <w:right w:type="dxa" w:w="120"/>
+            </w:tcMar>
+          </w:tcPr>
+          <w:p>
+            <w:pPr>
+              <w:spacing w:after="40" w:line="280"/>
+            </w:pPr>
+            <w:r>
+              <w:rPr>
+                <w:rFonts w:ascii="Times New Roman" w:cs="Times New Roman" w:eastAsia="SimSun" w:hAnsi="Times New Roman"/>
+                <w:sz w:val="24"/>
+                <w:szCs w:val="24"/>
+              </w:rPr>
               <w:t xml:space="preserve">/admin/test</w:t>
             </w:r>
           </w:p>
@@ -4733,7 +5259,7 @@
                 <w:sz w:val="24"/>
                 <w:szCs w:val="24"/>
               </w:rPr>
-              <w:t xml:space="preserve">后端地址连通性测试，参数 url/method/timeoutMs</w:t>
+              <w:t xml:space="preserve">后端地址连通性测试，参数 url/method/timeoutMs，需操作员及以上</w:t>
             </w:r>
           </w:p>
         </w:tc>

</xml_diff>